<commit_message>
tercer avance del semana 2
</commit_message>
<xml_diff>
--- a/Documento-Requerimientos-Construccion-Software-Grupo-B.docx
+++ b/Documento-Requerimientos-Construccion-Software-Grupo-B.docx
@@ -58,67 +58,25 @@
       </w:pPr>
       <w:r>
         <w:rPr>
-          <w:rFonts w:ascii="Times New Roman" w:hAnsi="Times New Roman"/>
-          <w:b/>
-          <w:bCs/>
-          <w:sz w:val="40"/>
-          <w:szCs w:val="40"/>
-        </w:rPr>
-        <w:t>FACULTAD DE CIENCIAS MATEMÁTICAS Y F</w:t>
-      </w:r>
-      <w:r>
-        <w:rPr>
-          <w:rFonts w:ascii="Times New Roman" w:hAnsi="Times New Roman"/>
-          <w:b/>
-          <w:bCs/>
-          <w:sz w:val="40"/>
-          <w:szCs w:val="40"/>
-        </w:rPr>
-        <w:t>ÍSI</w:t>
-      </w:r>
-      <w:r>
-        <w:rPr>
-          <w:rFonts w:ascii="Times New Roman" w:hAnsi="Times New Roman"/>
-          <w:b/>
-          <w:bCs/>
-          <w:sz w:val="40"/>
-          <w:szCs w:val="40"/>
-        </w:rPr>
-        <w:t>CAS</w:t>
-      </w:r>
-    </w:p>
-    <w:p>
-      <w:pPr>
-        <w:jc w:val="center"/>
-        <w:rPr>
-          <w:rFonts w:ascii="Times New Roman" w:hAnsi="Times New Roman"/>
-          <w:b/>
-          <w:bCs/>
-          <w:sz w:val="40"/>
-          <w:szCs w:val="40"/>
-        </w:rPr>
-      </w:pPr>
-      <w:r>
-        <w:rPr>
           <w:noProof/>
         </w:rPr>
         <w:drawing>
-          <wp:anchor distT="0" distB="0" distL="114300" distR="114300" simplePos="0" relativeHeight="251660288" behindDoc="1" locked="0" layoutInCell="1" allowOverlap="1" wp14:anchorId="0DAB6288" wp14:editId="2417C5A0">
+          <wp:anchor distT="0" distB="0" distL="114300" distR="114300" simplePos="0" relativeHeight="251660288" behindDoc="1" locked="0" layoutInCell="1" allowOverlap="1" wp14:anchorId="0DAB6288" wp14:editId="7ADD0AEC">
             <wp:simplePos x="0" y="0"/>
             <wp:positionH relativeFrom="margin">
-              <wp:align>center</wp:align>
+              <wp:posOffset>2167890</wp:posOffset>
             </wp:positionH>
             <wp:positionV relativeFrom="paragraph">
-              <wp:posOffset>4445</wp:posOffset>
+              <wp:posOffset>585470</wp:posOffset>
             </wp:positionV>
-            <wp:extent cx="1278890" cy="1278890"/>
-            <wp:effectExtent l="0" t="0" r="0" b="0"/>
+            <wp:extent cx="1609725" cy="1609725"/>
+            <wp:effectExtent l="0" t="0" r="9525" b="9525"/>
             <wp:wrapTight wrapText="bothSides">
               <wp:wrapPolygon edited="0">
                 <wp:start x="0" y="0"/>
-                <wp:lineTo x="0" y="21235"/>
-                <wp:lineTo x="21235" y="21235"/>
-                <wp:lineTo x="21235" y="0"/>
+                <wp:lineTo x="0" y="21472"/>
+                <wp:lineTo x="21472" y="21472"/>
+                <wp:lineTo x="21472" y="0"/>
                 <wp:lineTo x="0" y="0"/>
               </wp:wrapPolygon>
             </wp:wrapTight>
@@ -151,7 +109,7 @@
                   <pic:spPr bwMode="auto">
                     <a:xfrm>
                       <a:off x="0" y="0"/>
-                      <a:ext cx="1278890" cy="1278890"/>
+                      <a:ext cx="1609725" cy="1609725"/>
                     </a:xfrm>
                     <a:prstGeom prst="rect">
                       <a:avLst/>
@@ -173,6 +131,48 @@
           </wp:anchor>
         </w:drawing>
       </w:r>
+      <w:r>
+        <w:rPr>
+          <w:rFonts w:ascii="Times New Roman" w:hAnsi="Times New Roman"/>
+          <w:b/>
+          <w:bCs/>
+          <w:sz w:val="40"/>
+          <w:szCs w:val="40"/>
+        </w:rPr>
+        <w:t xml:space="preserve">FACULTAD DE CIENCIAS MATEMÁTICAS </w:t>
+      </w:r>
+      <w:r>
+        <w:rPr>
+          <w:rFonts w:ascii="Times New Roman" w:hAnsi="Times New Roman"/>
+          <w:b/>
+          <w:bCs/>
+          <w:sz w:val="40"/>
+          <w:szCs w:val="40"/>
+        </w:rPr>
+        <w:t xml:space="preserve">Y </w:t>
+      </w:r>
+      <w:r>
+        <w:rPr>
+          <w:rFonts w:ascii="Times New Roman" w:hAnsi="Times New Roman"/>
+          <w:b/>
+          <w:bCs/>
+          <w:sz w:val="40"/>
+          <w:szCs w:val="40"/>
+        </w:rPr>
+        <w:t>FÍSICAS</w:t>
+      </w:r>
+    </w:p>
+    <w:p>
+      <w:pPr>
+        <w:jc w:val="center"/>
+        <w:rPr>
+          <w:rFonts w:ascii="Times New Roman" w:hAnsi="Times New Roman"/>
+          <w:b/>
+          <w:bCs/>
+          <w:sz w:val="40"/>
+          <w:szCs w:val="40"/>
+        </w:rPr>
+      </w:pPr>
     </w:p>
     <w:p>
       <w:pPr>
@@ -419,25 +419,7 @@
           <w:sz w:val="24"/>
           <w:szCs w:val="24"/>
         </w:rPr>
-        <w:t xml:space="preserve">Depablos </w:t>
-      </w:r>
-      <w:r>
-        <w:rPr>
-          <w:rFonts w:ascii="Times New Roman" w:eastAsia="Times New Roman" w:hAnsi="Times New Roman" w:cs="Times New Roman"/>
-          <w:color w:val="1D2125"/>
-          <w:sz w:val="24"/>
-          <w:szCs w:val="24"/>
-        </w:rPr>
-        <w:t>Gómez</w:t>
-      </w:r>
-      <w:r>
-        <w:rPr>
-          <w:rFonts w:ascii="Times New Roman" w:eastAsia="Times New Roman" w:hAnsi="Times New Roman" w:cs="Times New Roman"/>
-          <w:color w:val="1D2125"/>
-          <w:sz w:val="24"/>
-          <w:szCs w:val="24"/>
-        </w:rPr>
-        <w:t xml:space="preserve"> Wuilker Farley</w:t>
+        <w:t>Depablos Gómez Wuilker Farley</w:t>
       </w:r>
     </w:p>
     <w:p>
@@ -578,16 +560,7 @@
           <w:sz w:val="24"/>
           <w:szCs w:val="24"/>
         </w:rPr>
-        <w:t xml:space="preserve">Paguay Calle </w:t>
-      </w:r>
-      <w:r>
-        <w:rPr>
-          <w:rFonts w:ascii="Times New Roman" w:eastAsia="Times New Roman" w:hAnsi="Times New Roman" w:cs="Times New Roman"/>
-          <w:color w:val="1D2125"/>
-          <w:sz w:val="24"/>
-          <w:szCs w:val="24"/>
-        </w:rPr>
-        <w:t>Adrián</w:t>
+        <w:t>Paguay Calle Adrián</w:t>
       </w:r>
       <w:r>
         <w:rPr>
@@ -640,13 +613,7 @@
         <w:rPr>
           <w:rFonts w:ascii="Times New Roman" w:hAnsi="Times New Roman"/>
         </w:rPr>
-        <w:t>1</w:t>
-      </w:r>
-      <w:r>
-        <w:rPr>
-          <w:rFonts w:ascii="Times New Roman" w:hAnsi="Times New Roman"/>
-        </w:rPr>
-        <w:t>5</w:t>
+        <w:t>15</w:t>
       </w:r>
       <w:r>
         <w:rPr>
@@ -1788,15 +1755,7 @@
           <w:sz w:val="24"/>
           <w:szCs w:val="24"/>
         </w:rPr>
-        <w:t xml:space="preserve">Visual Studio Code y </w:t>
-      </w:r>
-      <w:r>
-        <w:rPr>
-          <w:rFonts w:ascii="Times New Roman" w:hAnsi="Times New Roman" w:cs="Times New Roman"/>
-          <w:sz w:val="24"/>
-          <w:szCs w:val="24"/>
-        </w:rPr>
-        <w:t>Antigravity</w:t>
+        <w:t>Visual Studio Code y Antigravity</w:t>
       </w:r>
     </w:p>
     <w:p>
@@ -3559,6 +3518,7 @@
   <w:style w:type="character" w:default="1" w:styleId="Fuentedeprrafopredeter">
     <w:name w:val="Default Paragraph Font"/>
     <w:uiPriority w:val="1"/>
+    <w:semiHidden/>
     <w:unhideWhenUsed/>
   </w:style>
   <w:style w:type="table" w:default="1" w:styleId="Tablanormal">

</xml_diff>